<commit_message>
Lunch Expectations card on the six-step process; remove living-document and called-for-now language from schoolwide cards
</commit_message>
<xml_diff>
--- a/resources/systems/procedures/schoolwide/01-morning-entry.docx
+++ b/resources/systems/procedures/schoolwide/01-morning-entry.docx
@@ -143,200 +143,6 @@
         </w:rPr>
         <w:t xml:space="preserve">This also connects directly to Foundation 1: Adult Ownership. Amanda's session named three kinds of constancy — Emotional, Procedural, and Professional. Almost everything in this document is Procedural Constancy in action: proactively teaching expectations rather than reacting to their absence. Where a procedure leans more on Emotional Constancy (staying regulated, protecting dignity) or Professional Constancy (how adults coordinate with each other), it's named at the bottom of the card.</w:t>
       </w:r>
-      <w:r>
-        <w:rPr>
-          <w:rtl w:val="0"/>
-        </w:rPr>
-      </w:r>
-    </w:p>
-    <w:tbl>
-      <w:tblPr>
-        <w:tblStyle w:val="Table1"/>
-        <w:tblW w:w="10500.0" w:type="dxa"/>
-        <w:jc w:val="left"/>
-        <w:tblBorders>
-          <w:top w:color="d9d9d9" w:space="0" w:sz="4" w:val="single"/>
-          <w:left w:color="b3312c" w:space="0" w:sz="24" w:val="single"/>
-          <w:bottom w:color="d9d9d9" w:space="0" w:sz="4" w:val="single"/>
-          <w:right w:color="d9d9d9" w:space="0" w:sz="4" w:val="single"/>
-          <w:insideH w:color="000000" w:space="0" w:sz="0" w:val="nil"/>
-          <w:insideV w:color="000000" w:space="0" w:sz="0" w:val="nil"/>
-        </w:tblBorders>
-        <w:tblLayout w:type="fixed"/>
-        <w:tblLook w:val="0000"/>
-      </w:tblPr>
-      <w:tblGrid>
-        <w:gridCol w:w="10500"/>
-        <w:tblGridChange w:id="0">
-          <w:tblGrid>
-            <w:gridCol w:w="10500"/>
-          </w:tblGrid>
-        </w:tblGridChange>
-      </w:tblGrid>
-      <w:tr>
-        <w:trPr>
-          <w:cantSplit w:val="0"/>
-          <w:tblHeader w:val="0"/>
-        </w:trPr>
-        <w:tc>
-          <w:tcPr>
-            <w:shd w:fill="f2f2f2" w:val="clear"/>
-            <w:tcMar>
-              <w:top w:w="160.0" w:type="dxa"/>
-              <w:left w:w="200.0" w:type="dxa"/>
-              <w:bottom w:w="160.0" w:type="dxa"/>
-              <w:right w:w="200.0" w:type="dxa"/>
-            </w:tcMar>
-          </w:tcPr>
-          <w:p>
-            <w:pPr>
-              <w:spacing w:after="80" w:lineRule="auto"/>
-              <w:rPr/>
-            </w:pPr>
-            <w:r>
-              <w:rPr>
-                <w:rFonts w:ascii="Calibri" w:cs="Calibri" w:eastAsia="Calibri" w:hAnsi="Calibri"/>
-                <w:b w:val="1"/>
-                <w:bCs w:val="1"/>
-                <w:color w:val="b3312c"/>
-                <w:sz w:val="19"/>
-                <w:szCs w:val="19"/>
-                <w:rtl w:val="0"/>
-              </w:rPr>
-              <w:t xml:space="preserve">FORMAT NOTE</w:t>
-            </w:r>
-            <w:r>
-              <w:rPr>
-                <w:rtl w:val="0"/>
-              </w:rPr>
-            </w:r>
-          </w:p>
-          <w:p>
-            <w:pPr>
-              <w:spacing w:after="60" w:lineRule="auto"/>
-              <w:rPr/>
-            </w:pPr>
-            <w:r>
-              <w:rPr>
-                <w:rFonts w:ascii="Calibri" w:cs="Calibri" w:eastAsia="Calibri" w:hAnsi="Calibri"/>
-                <w:color w:val="1a1a1a"/>
-                <w:sz w:val="20"/>
-                <w:szCs w:val="20"/>
-                <w:rtl w:val="0"/>
-              </w:rPr>
-              <w:t xml:space="preserve">This follows the same shape used in the classroom-specific procedure cards — Teacher/Adult Does and Students Do, side by side. This is a school-wide procedure, not classroom-by-classroom, so there is no ‘Our Room’s Specifics’ column — the specification here is the specification, building-wide.</w:t>
-            </w:r>
-            <w:r>
-              <w:rPr>
-                <w:rtl w:val="0"/>
-              </w:rPr>
-            </w:r>
-          </w:p>
-        </w:tc>
-      </w:tr>
-    </w:tbl>
-    <w:p>
-      <w:pPr>
-        <w:spacing w:after="80" w:lineRule="auto"/>
-        <w:rPr/>
-      </w:pPr>
-      <w:r>
-        <w:rPr>
-          <w:rtl w:val="0"/>
-        </w:rPr>
-      </w:r>
-    </w:p>
-    <w:tbl>
-      <w:tblPr>
-        <w:tblStyle w:val="Table2"/>
-        <w:tblW w:w="10500.0" w:type="dxa"/>
-        <w:jc w:val="left"/>
-        <w:tblBorders>
-          <w:top w:color="d9d9d9" w:space="0" w:sz="4" w:val="single"/>
-          <w:left w:color="b3312c" w:space="0" w:sz="24" w:val="single"/>
-          <w:bottom w:color="d9d9d9" w:space="0" w:sz="4" w:val="single"/>
-          <w:right w:color="d9d9d9" w:space="0" w:sz="4" w:val="single"/>
-          <w:insideH w:color="000000" w:space="0" w:sz="0" w:val="nil"/>
-          <w:insideV w:color="000000" w:space="0" w:sz="0" w:val="nil"/>
-        </w:tblBorders>
-        <w:tblLayout w:type="fixed"/>
-        <w:tblLook w:val="0000"/>
-      </w:tblPr>
-      <w:tblGrid>
-        <w:gridCol w:w="10500"/>
-        <w:tblGridChange w:id="0">
-          <w:tblGrid>
-            <w:gridCol w:w="10500"/>
-          </w:tblGrid>
-        </w:tblGridChange>
-      </w:tblGrid>
-      <w:tr>
-        <w:trPr>
-          <w:cantSplit w:val="0"/>
-          <w:tblHeader w:val="0"/>
-        </w:trPr>
-        <w:tc>
-          <w:tcPr>
-            <w:shd w:fill="f2f2f2" w:val="clear"/>
-            <w:tcMar>
-              <w:top w:w="160.0" w:type="dxa"/>
-              <w:left w:w="200.0" w:type="dxa"/>
-              <w:bottom w:w="160.0" w:type="dxa"/>
-              <w:right w:w="200.0" w:type="dxa"/>
-            </w:tcMar>
-          </w:tcPr>
-          <w:p>
-            <w:pPr>
-              <w:spacing w:after="80" w:lineRule="auto"/>
-              <w:rPr/>
-            </w:pPr>
-            <w:r>
-              <w:rPr>
-                <w:rFonts w:ascii="Calibri" w:cs="Calibri" w:eastAsia="Calibri" w:hAnsi="Calibri"/>
-                <w:b w:val="1"/>
-                <w:bCs w:val="1"/>
-                <w:color w:val="b3312c"/>
-                <w:sz w:val="19"/>
-                <w:szCs w:val="19"/>
-                <w:rtl w:val="0"/>
-              </w:rPr>
-              <w:t xml:space="preserve">THIS IS A LIVING DOCUMENT</w:t>
-            </w:r>
-            <w:r>
-              <w:rPr>
-                <w:rtl w:val="0"/>
-              </w:rPr>
-            </w:r>
-          </w:p>
-          <w:p>
-            <w:pPr>
-              <w:spacing w:after="60" w:lineRule="auto"/>
-              <w:rPr/>
-            </w:pPr>
-            <w:r>
-              <w:rPr>
-                <w:rFonts w:ascii="Calibri" w:cs="Calibri" w:eastAsia="Calibri" w:hAnsi="Calibri"/>
-                <w:color w:val="1a1a1a"/>
-                <w:sz w:val="20"/>
-                <w:szCs w:val="20"/>
-                <w:rtl w:val="0"/>
-              </w:rPr>
-              <w:t xml:space="preserve">A few specifics in this document were genuinely undecided when it was written. Rather than leave them blank, a call was made so staff have one clear answer to teach and hold — those calls are marked ✎ throughout. None of them are permanent. If one doesn’t hold up in practice, revise it and move on — that’s expected, not a failure of the plan.</w:t>
-            </w:r>
-            <w:r>
-              <w:rPr>
-                <w:rtl w:val="0"/>
-              </w:rPr>
-            </w:r>
-          </w:p>
-        </w:tc>
-      </w:tr>
-    </w:tbl>
-    <w:p>
-      <w:pPr>
-        <w:spacing w:after="80" w:lineRule="auto"/>
-        <w:rPr/>
-      </w:pPr>
       <w:r>
         <w:rPr>
           <w:rtl w:val="0"/>
@@ -2456,7 +2262,7 @@
           <w:szCs w:val="40"/>
           <w:rtl w:val="0"/>
         </w:rPr>
-        <w:t xml:space="preserve">Teaching Morning Entry: Sample Script</w:t>
+        <w:t>Teaching Morning Entry: Script</w:t>
       </w:r>
       <w:r>
         <w:rPr>
@@ -2481,7 +2287,7 @@
           <w:szCs w:val="21"/>
           <w:rtl w:val="0"/>
         </w:rPr>
-        <w:t xml:space="preserve">This is a sample script. It's meant to be taught, not read verbatim — add your own school's language, examples, and personality before you use it. This example walks through the full path, Door 2 to Threshold, so adapt the pacing if your team teaches it in pieces (e.g., hallway path one day, classroom entry the next).</w:t>
+        <w:t>Use this script to teach the routine. It walks through the full path, Door 2 to Threshold. When the routine is taught in two parts, teach the hallway path one day and classroom entry the next.</w:t>
       </w:r>
       <w:r>
         <w:rPr>
@@ -3213,31 +3019,6 @@
           <w:rtl w:val="0"/>
         </w:rPr>
         <w:t xml:space="preserve">By day 5 or sooner, expect students to complete the full sequence — hallway path through Start — without a verbal prompt.</w:t>
-      </w:r>
-      <w:r>
-        <w:rPr>
-          <w:rtl w:val="0"/>
-        </w:rPr>
-      </w:r>
-    </w:p>
-    <w:p>
-      <w:pPr>
-        <w:spacing w:after="120" w:before="0" w:lineRule="auto"/>
-        <w:rPr/>
-      </w:pPr>
-      <w:r>
-        <w:rPr>
-          <w:rFonts w:ascii="Calibri" w:cs="Calibri" w:eastAsia="Calibri" w:hAnsi="Calibri"/>
-          <w:b w:val="0"/>
-          <w:bCs w:val="0"/>
-          <w:i w:val="1"/>
-          <w:iCs w:val="1"/>
-          <w:color w:val="1a1a1a"/>
-          <w:sz w:val="21"/>
-          <w:szCs w:val="21"/>
-          <w:rtl w:val="0"/>
-        </w:rPr>
-        <w:t xml:space="preserve">Personalize before you teach it: walk your own building's actual path, and use the language your students already know.</w:t>
       </w:r>
       <w:r>
         <w:rPr>

</xml_diff>